<commit_message>
docs: actualiza guia y evidencias con cobertura 100% en SonarQube
Co-authored-by: Cursor <cursoragent@cursor.com>
</commit_message>
<xml_diff>
--- a/docs/pruebas/Guía de Práctica de Ejecución de Pruebas - Completada (actualizada).docx
+++ b/docs/pruebas/Guía de Práctica de Ejecución de Pruebas - Completada (actualizada).docx
@@ -1544,7 +1544,7 @@
                 <w:sz w:val="18"/>
                 <w:szCs w:val="18"/>
               </w:rPr>
-              <w:t xml:space="preserve">La suite completa se vuelve a ejecutar tras cada cambio para detectar daños en funcionalidades existentes (105 pruebas aprobadas tras corregir los defectos).</w:t>
+              <w:t xml:space="preserve">La suite completa se vuelve a ejecutar tras cada cambio para detectar daños en funcionalidades existentes (153 pruebas aprobadas tras corregir los defectos y ampliar la cobertura).</w:t>
             </w:r>
           </w:p>
         </w:tc>
@@ -13967,7 +13967,7 @@
       </w:pPr>
       <w:r>
         <w:rPr/>
-        <w:t xml:space="preserve">Contexto de la suite completa del proyecto, ejecutada con cobertura (php artisan test --coverage-clover=coverage.xml): 105 pruebas aprobadas, 0 fallidas, 0 omitidas, 1 009 aserciones, 62,66 s. Antes de la corrección eran 99 pruebas y 952 aserciones.</w:t>
+        <w:t xml:space="preserve">Contexto de la suite completa del proyecto, ejecutada con cobertura (php artisan test --coverage-clover=coverage.xml): 153 pruebas aprobadas, 0 fallidas, 0 omitidas, 1 549 aserciones, 85,23 s. Antes de la corrección eran 99 pruebas y 952 aserciones; tras corregir los defectos fueron 105 y la ampliación posterior de cobertura las llevó a 153.</w:t>
       </w:r>
     </w:p>
     <w:p>
@@ -14491,7 +14491,7 @@
       </w:pPr>
       <w:r>
         <w:rPr/>
-        <w:t xml:space="preserve">Cubrir MaestroContratoController (38,5 % de cobertura) y CuentaColaboradorController (47,8 %), los dos archivos menos cubiertos de los módulos.</w:t>
+        <w:t xml:space="preserve">Ampliación realizada: se cubrieron MaestroContratoController (de 38,5 % a 100 %) y CuentaColaboradorController (de 47,8 % a 100 %), los dos archivos menos cubiertos de los módulos, y el resto del proyecto hasta el 100 %.</w:t>
       </w:r>
     </w:p>
     <w:p>
@@ -15023,7 +15023,7 @@
                 <w:sz w:val="18"/>
                 <w:szCs w:val="18"/>
               </w:rPr>
-              <w:t xml:space="preserve">Reporte Clover generado con php artisan test --coverage-clover=coverage.xml (105 pruebas) y leído mediante sonar.php.coverage.reportPaths=coverage.xml. Se excluyen de la cobertura database, vistas, resources/js, firmware y bootstrap.</w:t>
+              <w:t xml:space="preserve">Reporte Clover generado con php artisan test --coverage-clover=coverage.xml (153 pruebas, con app y routes dentro del alcance de cobertura) y leído mediante sonar.php.coverage.reportPaths=coverage.xml. Se excluyen de la cobertura database, vistas, resources/js, firmware y bootstrap.</w:t>
             </w:r>
           </w:p>
         </w:tc>
@@ -15101,7 +15101,7 @@
                 <w:sz w:val="18"/>
                 <w:szCs w:val="18"/>
               </w:rPr>
-              <w:t xml:space="preserve">ANALYSIS SUCCESSFUL el 26/10/2026 a las 16:11, sobre el commit da0f184; tarea del servidor en estado SUCCESS (6,9 s) y sin advertencias. Panel: http://localhost:9000/dashboard?id=Ecociudad.</w:t>
+              <w:t xml:space="preserve">ANALYSIS SUCCESSFUL el 26/10/2026 a las 16:52, sobre el commit ccf7e2f; tarea del servidor en estado SUCCESS y sin advertencias. Panel: http://localhost:9000/dashboard?id=Ecociudad.</w:t>
             </w:r>
           </w:p>
         </w:tc>
@@ -15140,7 +15140,7 @@
                 <w:sz w:val="18"/>
                 <w:szCs w:val="18"/>
               </w:rPr>
-              <w:t xml:space="preserve">A las 15:41, antes de corregir los defectos, el análisis ya resultó aprobado con las mismas cifras de bugs, vulnerabilidades y code smells (0), cobertura de 83,3 % y duplicación de 1,5 %; tenía una advertencia por 16 archivos sin confirmar en Git.</w:t>
+              <w:t xml:space="preserve">A las 16:11 (commit da0f184) la cobertura global era de 83,3 % (520 de 3 122 líneas sin cubrir) con 0 issues; a las 15:41, antes de corregir los defectos, el análisis ya resultaba aprobado con esa cobertura y una advertencia por 16 archivos sin confirmar en Git.</w:t>
             </w:r>
           </w:p>
         </w:tc>
@@ -15355,7 +15355,7 @@
                 <w:sz w:val="20"/>
                 <w:szCs w:val="20"/>
               </w:rPr>
-              <w:t xml:space="preserve">Se cumplen las tres condiciones configuradas sobre código nuevo: cobertura 94,8 % (mínimo 80 %), duplicación 0,0 % (máximo 3 %) y 0 violaciones nuevas.</w:t>
+              <w:t xml:space="preserve">Se cumplen las tres condiciones configuradas sobre código nuevo: cobertura 100 % (mínimo 80 %), duplicación 0,0 % (máximo 3 %) y 0 violaciones nuevas.</w:t>
             </w:r>
           </w:p>
         </w:tc>
@@ -15559,7 +15559,7 @@
                 <w:sz w:val="20"/>
                 <w:szCs w:val="20"/>
               </w:rPr>
-              <w:t xml:space="preserve">83,3 % (520 de 3 122 líneas a cubrir sin cubrir)</w:t>
+              <w:t xml:space="preserve">100 % (0 de 3 211 líneas a cubrir sin cubrir)</w:t>
             </w:r>
           </w:p>
         </w:tc>
@@ -15577,7 +15577,7 @@
                 <w:sz w:val="20"/>
                 <w:szCs w:val="20"/>
               </w:rPr>
-              <w:t xml:space="preserve">Cobertura global alta, medida con el reporte de la suite de 105 pruebas. La cobertura de resources/js no se mide (excluida).</w:t>
+              <w:t xml:space="preserve">Cobertura total, medida con el reporte de la suite de 153 pruebas (alcance: app y routes). La cobertura de resources/js no se mide (excluida).</w:t>
             </w:r>
           </w:p>
         </w:tc>
@@ -15624,7 +15624,7 @@
                 <w:sz w:val="20"/>
                 <w:szCs w:val="20"/>
               </w:rPr>
-              <w:t xml:space="preserve">1,4 %</w:t>
+              <w:t xml:space="preserve">1,5 %</w:t>
             </w:r>
           </w:p>
         </w:tc>
@@ -15936,7 +15936,7 @@
                 <w:sz w:val="18"/>
                 <w:szCs w:val="18"/>
               </w:rPr>
-              <w:t xml:space="preserve">14 632 líneas de código (ncloc) en 171 archivos; 17 341 líneas en total.</w:t>
+              <w:t xml:space="preserve">14 596 líneas de código (ncloc) en 171 archivos; 17 301 líneas en total.</w:t>
             </w:r>
           </w:p>
         </w:tc>
@@ -15992,7 +15992,7 @@
                 <w:sz w:val="18"/>
                 <w:szCs w:val="18"/>
               </w:rPr>
-              <w:t xml:space="preserve">Ciclomática 1 933; cognitiva 607.</w:t>
+              <w:t xml:space="preserve">Ciclomática 1 921; cognitiva 592.</w:t>
             </w:r>
           </w:p>
         </w:tc>
@@ -16285,7 +16285,7 @@
                 <w:sz w:val="16"/>
                 <w:szCs w:val="16"/>
               </w:rPr>
-              <w:t xml:space="preserve">98,5 %</w:t>
+              <w:t xml:space="preserve">100 %</w:t>
             </w:r>
           </w:p>
         </w:tc>
@@ -16302,7 +16302,7 @@
                 <w:sz w:val="16"/>
                 <w:szCs w:val="16"/>
               </w:rPr>
-              <w:t xml:space="preserve">3</w:t>
+              <w:t xml:space="preserve">0</w:t>
             </w:r>
           </w:p>
         </w:tc>
@@ -16393,7 +16393,7 @@
                 <w:sz w:val="16"/>
                 <w:szCs w:val="16"/>
               </w:rPr>
-              <w:t xml:space="preserve">47,8 %</w:t>
+              <w:t xml:space="preserve">100 %</w:t>
             </w:r>
           </w:p>
         </w:tc>
@@ -16410,7 +16410,7 @@
                 <w:sz w:val="16"/>
                 <w:szCs w:val="16"/>
               </w:rPr>
-              <w:t xml:space="preserve">36</w:t>
+              <w:t xml:space="preserve">0</w:t>
             </w:r>
           </w:p>
         </w:tc>
@@ -16501,7 +16501,7 @@
                 <w:sz w:val="16"/>
                 <w:szCs w:val="16"/>
               </w:rPr>
-              <w:t xml:space="preserve">38,5 %</w:t>
+              <w:t xml:space="preserve">100 %</w:t>
             </w:r>
           </w:p>
         </w:tc>
@@ -16518,7 +16518,7 @@
                 <w:sz w:val="16"/>
                 <w:szCs w:val="16"/>
               </w:rPr>
-              <w:t xml:space="preserve">75</w:t>
+              <w:t xml:space="preserve">0</w:t>
             </w:r>
           </w:p>
         </w:tc>
@@ -16608,7 +16608,7 @@
                 <w:sz w:val="16"/>
                 <w:szCs w:val="16"/>
               </w:rPr>
-              <w:t xml:space="preserve">95,1 %</w:t>
+              <w:t xml:space="preserve">100 %</w:t>
             </w:r>
           </w:p>
         </w:tc>
@@ -16625,7 +16625,7 @@
                 <w:sz w:val="16"/>
                 <w:szCs w:val="16"/>
               </w:rPr>
-              <w:t xml:space="preserve">2</w:t>
+              <w:t xml:space="preserve">0</w:t>
             </w:r>
           </w:p>
         </w:tc>
@@ -16822,7 +16822,7 @@
                 <w:sz w:val="16"/>
                 <w:szCs w:val="16"/>
               </w:rPr>
-              <w:t xml:space="preserve">89,8 %</w:t>
+              <w:t xml:space="preserve">100 %</w:t>
             </w:r>
           </w:p>
         </w:tc>
@@ -16839,7 +16839,7 @@
                 <w:sz w:val="16"/>
                 <w:szCs w:val="16"/>
               </w:rPr>
-              <w:t xml:space="preserve">9</w:t>
+              <w:t xml:space="preserve">0</w:t>
             </w:r>
           </w:p>
         </w:tc>
@@ -16929,7 +16929,7 @@
                 <w:sz w:val="16"/>
                 <w:szCs w:val="16"/>
               </w:rPr>
-              <w:t xml:space="preserve">94,7 %</w:t>
+              <w:t xml:space="preserve">100 %</w:t>
             </w:r>
           </w:p>
         </w:tc>
@@ -16946,7 +16946,7 @@
                 <w:sz w:val="16"/>
                 <w:szCs w:val="16"/>
               </w:rPr>
-              <w:t xml:space="preserve">1</w:t>
+              <w:t xml:space="preserve">0</w:t>
             </w:r>
           </w:p>
         </w:tc>
@@ -17036,7 +17036,7 @@
                 <w:sz w:val="16"/>
                 <w:szCs w:val="16"/>
               </w:rPr>
-              <w:t xml:space="preserve">76,5 %</w:t>
+              <w:t xml:space="preserve">100 %</w:t>
             </w:r>
           </w:p>
         </w:tc>
@@ -17053,7 +17053,7 @@
                 <w:sz w:val="16"/>
                 <w:szCs w:val="16"/>
               </w:rPr>
-              <w:t xml:space="preserve">4</w:t>
+              <w:t xml:space="preserve">0</w:t>
             </w:r>
           </w:p>
         </w:tc>
@@ -17143,7 +17143,7 @@
                 <w:sz w:val="16"/>
                 <w:szCs w:val="16"/>
               </w:rPr>
-              <w:t xml:space="preserve">96,3 %</w:t>
+              <w:t xml:space="preserve">100 %</w:t>
             </w:r>
           </w:p>
         </w:tc>
@@ -17160,7 +17160,7 @@
                 <w:sz w:val="16"/>
                 <w:szCs w:val="16"/>
               </w:rPr>
-              <w:t xml:space="preserve">1</w:t>
+              <w:t xml:space="preserve">0</w:t>
             </w:r>
           </w:p>
         </w:tc>
@@ -17429,7 +17429,7 @@
       </w:r>
       <w:r>
         <w:rPr/>
-        <w:t xml:space="preserve"> El análisis estático no identificó issues: 0 abiertos. Los puntos débiles son de cobertura en dos controladores de contratos y una duplicación de 1,4 %.</w:t>
+        <w:t xml:space="preserve"> El análisis estático no identificó issues: 0 abiertos. La cobertura de líneas llega al 100 %; el único punto a vigilar es una duplicación de 1,5 %, dentro del límite del 3 %.</w:t>
       </w:r>
     </w:p>
     <w:p>
@@ -17469,7 +17469,7 @@
       </w:r>
       <w:r>
         <w:rPr/>
-        <w:t xml:space="preserve"> 83,3 % global (520 líneas sin cubrir de 3 122) y 94,8 % en código nuevo.</w:t>
+        <w:t xml:space="preserve"> 100 % global (0 líneas sin cubrir de 3 211) y 100 % en código nuevo.</w:t>
       </w:r>
     </w:p>
     <w:p>
@@ -17489,7 +17489,7 @@
       </w:r>
       <w:r>
         <w:rPr/>
-        <w:t xml:space="preserve"> MaestroContratoController (38,5 % y 75 líneas sin cubrir), CuentaColaboradorController (47,8 %) y Colaborador (76,5 %). Son los que gestionan maestros, cuentas y datos personales.</w:t>
+        <w:t xml:space="preserve"> Ninguna por cobertura de líneas: MaestroContratoController, CuentaColaboradorController y Colaborador, que eran los más débiles (38,5 %, 47,8 % y 76,5 %), quedaron al 100 %. Fuera de la medición siguen resources/js (interfaz React), las vistas y el firmware, que PHPUnit no ejecuta.</w:t>
       </w:r>
     </w:p>
     <w:p>
@@ -17509,7 +17509,7 @@
       </w:r>
       <w:r>
         <w:rPr/>
-        <w:t xml:space="preserve"> Los defectos funcionales D-01, D-02 y D-03 eran la prioridad, porque impedían renovar contratos y comprometían la trazabilidad de las incidencias; ya están corregidos y verificados. Lo siguiente es la cobertura de los controladores de contratos con menor porcentaje.</w:t>
+        <w:t xml:space="preserve"> Los defectos funcionales D-01, D-02 y D-03 eran la prioridad, porque impedían renovar contratos y comprometían la trazabilidad de las incidencias; ya están corregidos y verificados. Después se cubrieron con pruebas los controladores de contratos que tenían menor porcentaje y el resto del proyecto.</w:t>
       </w:r>
     </w:p>
     <w:p>
@@ -17529,7 +17529,7 @@
       </w:r>
       <w:r>
         <w:rPr/>
-        <w:t xml:space="preserve"> Son complementarios. SonarQube informó 0 bugs y calificación A antes y después de la corrección, pero las pruebas funcionales encontraron 3 defectos de reglas de negocio: el análisis estático no conoce el comportamiento esperado del negocio. A la inversa, la cobertura de Sonar muestra qué partes no fueron ejercitadas por las pruebas, y el código corregido quedó con 100 % de cobertura en AdminController.</w:t>
+        <w:t xml:space="preserve"> Son complementarios. SonarQube informó 0 bugs y calificación A antes y después de la corrección, pero las pruebas funcionales encontraron 3 defectos de reglas de negocio: el análisis estático no conoce el comportamiento esperado del negocio. A la inversa, la cobertura de Sonar muestra qué partes no fueron ejercitadas por las pruebas, y todo el código del proyecto, incluido el corregido, quedó con 100 % de cobertura.</w:t>
       </w:r>
     </w:p>
     <w:p>
@@ -17677,7 +17677,7 @@
                 <w:sz w:val="16"/>
                 <w:szCs w:val="16"/>
               </w:rPr>
-              <w:t xml:space="preserve">Agregar pruebas para MaestroContratoController hasta superar el 80 % de cobertura.</w:t>
+              <w:t xml:space="preserve">Mantener MaestroContratoController al 100 % con las pruebas de MaestrosYCuentasTest.</w:t>
             </w:r>
           </w:p>
         </w:tc>
@@ -17694,7 +17694,7 @@
                 <w:sz w:val="16"/>
                 <w:szCs w:val="16"/>
               </w:rPr>
-              <w:t xml:space="preserve">38,5 % de cobertura y 75 líneas sin cubrir en Sonar.</w:t>
+              <w:t xml:space="preserve">Antes: 38,5 % y 75 líneas sin cubrir; ahora 100 % y 0 sin cubrir.</w:t>
             </w:r>
           </w:p>
         </w:tc>
@@ -17733,7 +17733,7 @@
                 <w:sz w:val="16"/>
                 <w:szCs w:val="16"/>
               </w:rPr>
-              <w:t xml:space="preserve">Agregar pruebas para CuentaColaboradorController hasta superar el 80 % de cobertura.</w:t>
+              <w:t xml:space="preserve">Mantener CuentaColaboradorController al 100 % con las mismas pruebas.</w:t>
             </w:r>
           </w:p>
         </w:tc>
@@ -17750,7 +17750,7 @@
                 <w:sz w:val="16"/>
                 <w:szCs w:val="16"/>
               </w:rPr>
-              <w:t xml:space="preserve">47,8 % de cobertura y 36 líneas sin cubrir.</w:t>
+              <w:t xml:space="preserve">Antes: 47,8 % y 36 líneas sin cubrir; ahora 100 % y 0 sin cubrir.</w:t>
             </w:r>
           </w:p>
         </w:tc>
@@ -17789,7 +17789,7 @@
                 <w:sz w:val="16"/>
                 <w:szCs w:val="16"/>
               </w:rPr>
-              <w:t xml:space="preserve">Cubrir las ramas pendientes de Colaborador y de LimpiezaController.</w:t>
+              <w:t xml:space="preserve">Conservar la cobertura de Colaborador y de LimpiezaController.</w:t>
             </w:r>
           </w:p>
         </w:tc>
@@ -17806,7 +17806,7 @@
                 <w:sz w:val="16"/>
                 <w:szCs w:val="16"/>
               </w:rPr>
-              <w:t xml:space="preserve">76,5 % y 89,8 % de cobertura.</w:t>
+              <w:t xml:space="preserve">Antes: 76,5 % y 89,8 %; ahora 100 % en ambos.</w:t>
             </w:r>
           </w:p>
         </w:tc>
@@ -18241,7 +18241,7 @@
       </w:pPr>
       <w:r>
         <w:rPr/>
-        <w:t xml:space="preserve">Tras las correcciones, los 30 casos del plan (se añadieron INC-13 y CON-17) se aprobaron: 100 %. Se automatizaron los 30 con PHPUnit en 13,83 s; la suite completa del proyecto suma 105 pruebas aprobadas y 1 009 aserciones.</w:t>
+        <w:t xml:space="preserve">Tras las correcciones, los 30 casos del plan (se añadieron INC-13 y CON-17) se aprobaron: 100 %. Se automatizaron los 30 con PHPUnit en 13,83 s; la suite completa del proyecto suma 153 pruebas aprobadas y 1 549 aserciones.</w:t>
       </w:r>
     </w:p>
     <w:p>
@@ -18254,7 +18254,7 @@
       </w:pPr>
       <w:r>
         <w:rPr/>
-        <w:t xml:space="preserve">SonarQube aprobó el Quality Gate con 0 bugs, 0 vulnerabilidades, 0 code smells, calificaciones A, 83,3 % de cobertura global, 94,8 % en código nuevo y 1,4 % de duplicación. Los archivos con menor cobertura son MaestroContratoController (38,5 %) y CuentaColaboradorController (47,8 %).</w:t>
+        <w:t xml:space="preserve">SonarQube aprobó el Quality Gate con 0 bugs, 0 vulnerabilidades, 0 code smells, calificaciones A, 100 % de cobertura global y en código nuevo y 1,5 % de duplicación. Todos los archivos tienen 100 % de cobertura de líneas, incluidos MaestroContratoController y CuentaColaboradorController, que antes tenían 38,5 % y 47,8 %.</w:t>
       </w:r>
     </w:p>
     <w:p>

</xml_diff>